<commit_message>
Alteração nos documentos e página crescimento estratégico
</commit_message>
<xml_diff>
--- a/docs/detalhamento_modelo_random_forest.docx
+++ b/docs/detalhamento_modelo_random_forest.docx
@@ -4,55 +4,30 @@
   <w:body>
     <w:p>
       <w:pPr>
+        <w:spacing w:after="160"/>
         <w:jc w:val="center"/>
       </w:pPr>
       <w:r>
         <w:rPr>
-          <w:rFonts w:ascii="Arial" w:hAnsi="Arial" w:eastAsia="Arial"/>
           <w:b/>
-          <w:sz w:val="36"/>
+          <w:color w:val="1F4E79"/>
+          <w:sz w:val="40"/>
         </w:rPr>
-        <w:t>Detalhamento do Modelo de IA</w:t>
+        <w:t>Detalhamento do Modelo Random Forest</w:t>
       </w:r>
     </w:p>
     <w:p>
       <w:pPr>
+        <w:spacing w:after="320"/>
         <w:jc w:val="center"/>
       </w:pPr>
       <w:r>
         <w:rPr>
-          <w:rFonts w:ascii="Arial" w:hAnsi="Arial" w:eastAsia="Arial"/>
-          <w:b w:val="0"/>
-          <w:sz w:val="22"/>
+          <w:i/>
+          <w:color w:val="5A5A5A"/>
+          <w:sz w:val="20"/>
         </w:rPr>
-        <w:t>Random Forest - Crescimento Estratégico</w:t>
-      </w:r>
-    </w:p>
-    <w:p/>
-    <w:p>
-      <w:pPr>
-        <w:pStyle w:val="Heading1"/>
-      </w:pPr>
-      <w:r>
-        <w:rPr>
-          <w:rFonts w:ascii="Arial" w:hAnsi="Arial" w:eastAsia="Arial"/>
-          <w:b/>
-          <w:sz w:val="28"/>
-        </w:rPr>
-        <w:t>1. Objetivo do modelo</w:t>
-      </w:r>
-    </w:p>
-    <w:p>
-      <w:pPr>
-        <w:spacing w:after="120"/>
-      </w:pPr>
-      <w:r>
-        <w:rPr>
-          <w:rFonts w:ascii="Arial" w:hAnsi="Arial" w:eastAsia="Arial"/>
-          <w:b w:val="0"/>
-          <w:sz w:val="22"/>
-        </w:rPr>
-        <w:t>O modelo de IA tem como objetivo apoiar a decisão estratégica, classificando clientes com maior risco de churn e maior propensão de compra ou upgrade de plano.</w:t>
+        <w:t>FirewallSign - Desafio Integrador 2026</w:t>
       </w:r>
     </w:p>
     <w:p>
@@ -60,25 +35,15 @@
         <w:pStyle w:val="Heading1"/>
       </w:pPr>
       <w:r>
-        <w:rPr>
-          <w:rFonts w:ascii="Arial" w:hAnsi="Arial" w:eastAsia="Arial"/>
-          <w:b/>
-          <w:sz w:val="28"/>
-        </w:rPr>
-        <w:t>2. Modelo escolhido</w:t>
+        <w:t>1. Objetivo do modelo</w:t>
       </w:r>
     </w:p>
     <w:p>
       <w:pPr>
-        <w:spacing w:after="120"/>
+        <w:jc w:val="both"/>
       </w:pPr>
       <w:r>
-        <w:rPr>
-          <w:rFonts w:ascii="Arial" w:hAnsi="Arial" w:eastAsia="Arial"/>
-          <w:b w:val="0"/>
-          <w:sz w:val="22"/>
-        </w:rPr>
-        <w:t>Foi utilizado o algoritmo Random Forest, que combina várias árvores de decisão para gerar uma classificação mais estável. O modelo foi escolhido por ser simples de explicar, funcionar bem com bases pequenas e aceitar variáveis numéricas e categóricas após tratamento.</w:t>
+        <w:t>O modelo Random Forest foi utilizado para apoiar a análise estratégica dos clientes. Ele classifica clientes ativos quanto ao risco de churn e ao potencial de crescimento, além de diferenciar clientes já cancelados como churn confirmado.</w:t>
       </w:r>
     </w:p>
     <w:p>
@@ -86,12 +51,7 @@
         <w:pStyle w:val="Heading1"/>
       </w:pPr>
       <w:r>
-        <w:rPr>
-          <w:rFonts w:ascii="Arial" w:hAnsi="Arial" w:eastAsia="Arial"/>
-          <w:b/>
-          <w:sz w:val="28"/>
-        </w:rPr>
-        <w:t>3. Entradas utilizadas</w:t>
+        <w:t>2. Modelo utilizado</w:t>
       </w:r>
     </w:p>
     <w:tbl>
@@ -102,37 +62,37 @@
         <w:tblLook w:firstColumn="1" w:firstRow="1" w:lastColumn="0" w:lastRow="0" w:noHBand="0" w:noVBand="1" w:val="04A0"/>
       </w:tblPr>
       <w:tblGrid>
-        <w:gridCol w:w="4968"/>
-        <w:gridCol w:w="4968"/>
+        <w:gridCol w:w="5040"/>
+        <w:gridCol w:w="5040"/>
       </w:tblGrid>
       <w:tr>
         <w:tc>
           <w:tcPr>
-            <w:tcW w:type="dxa" w:w="4968"/>
+            <w:tcW w:type="dxa" w:w="5040"/>
+            <w:vAlign w:val="center"/>
             <w:shd w:fill="D9EAF7"/>
-            <w:vAlign w:val="center"/>
           </w:tcPr>
           <w:p>
+            <w:r/>
             <w:r>
               <w:rPr>
-                <w:rFonts w:ascii="Arial" w:hAnsi="Arial" w:eastAsia="Arial"/>
                 <w:b/>
                 <w:sz w:val="20"/>
               </w:rPr>
-              <w:t>Campo</w:t>
+              <w:t>Item</w:t>
             </w:r>
           </w:p>
         </w:tc>
         <w:tc>
           <w:tcPr>
-            <w:tcW w:type="dxa" w:w="4968"/>
+            <w:tcW w:type="dxa" w:w="5040"/>
+            <w:vAlign w:val="center"/>
             <w:shd w:fill="D9EAF7"/>
-            <w:vAlign w:val="center"/>
           </w:tcPr>
           <w:p>
+            <w:r/>
             <w:r>
               <w:rPr>
-                <w:rFonts w:ascii="Arial" w:hAnsi="Arial" w:eastAsia="Arial"/>
                 <w:b/>
                 <w:sz w:val="20"/>
               </w:rPr>
@@ -144,31 +104,33 @@
       <w:tr>
         <w:tc>
           <w:tcPr>
-            <w:tcW w:type="dxa" w:w="4968"/>
+            <w:tcW w:type="dxa" w:w="5040"/>
+            <w:vAlign w:val="center"/>
           </w:tcPr>
           <w:p>
+            <w:r/>
             <w:r>
               <w:rPr>
-                <w:rFonts w:ascii="Arial" w:hAnsi="Arial" w:eastAsia="Arial"/>
                 <w:b w:val="0"/>
                 <w:sz w:val="20"/>
               </w:rPr>
-              <w:t>valorMensal</w:t>
+              <w:t>Algoritmo</w:t>
             </w:r>
           </w:p>
         </w:tc>
         <w:tc>
           <w:tcPr>
-            <w:tcW w:type="dxa" w:w="4968"/>
+            <w:tcW w:type="dxa" w:w="5040"/>
+            <w:vAlign w:val="center"/>
           </w:tcPr>
           <w:p>
+            <w:r/>
             <w:r>
               <w:rPr>
-                <w:rFonts w:ascii="Arial" w:hAnsi="Arial" w:eastAsia="Arial"/>
                 <w:b w:val="0"/>
                 <w:sz w:val="20"/>
               </w:rPr>
-              <w:t>Valor mensal da assinatura do cliente.</w:t>
+              <w:t>Random Forest Classifier</w:t>
             </w:r>
           </w:p>
         </w:tc>
@@ -176,31 +138,33 @@
       <w:tr>
         <w:tc>
           <w:tcPr>
-            <w:tcW w:type="dxa" w:w="4968"/>
+            <w:tcW w:type="dxa" w:w="5040"/>
+            <w:vAlign w:val="center"/>
           </w:tcPr>
           <w:p>
+            <w:r/>
             <w:r>
               <w:rPr>
-                <w:rFonts w:ascii="Arial" w:hAnsi="Arial" w:eastAsia="Arial"/>
                 <w:b w:val="0"/>
                 <w:sz w:val="20"/>
               </w:rPr>
-              <w:t>quantidadeFirewalls</w:t>
+              <w:t>Biblioteca</w:t>
             </w:r>
           </w:p>
         </w:tc>
         <w:tc>
           <w:tcPr>
-            <w:tcW w:type="dxa" w:w="4968"/>
+            <w:tcW w:type="dxa" w:w="5040"/>
+            <w:vAlign w:val="center"/>
           </w:tcPr>
           <w:p>
+            <w:r/>
             <w:r>
               <w:rPr>
-                <w:rFonts w:ascii="Arial" w:hAnsi="Arial" w:eastAsia="Arial"/>
                 <w:b w:val="0"/>
                 <w:sz w:val="20"/>
               </w:rPr>
-              <w:t>Quantidade de firewalls contratados.</w:t>
+              <w:t>Scikit-learn</w:t>
             </w:r>
           </w:p>
         </w:tc>
@@ -208,31 +172,33 @@
       <w:tr>
         <w:tc>
           <w:tcPr>
-            <w:tcW w:type="dxa" w:w="4968"/>
+            <w:tcW w:type="dxa" w:w="5040"/>
+            <w:vAlign w:val="center"/>
           </w:tcPr>
           <w:p>
+            <w:r/>
             <w:r>
               <w:rPr>
-                <w:rFonts w:ascii="Arial" w:hAnsi="Arial" w:eastAsia="Arial"/>
                 <w:b w:val="0"/>
                 <w:sz w:val="20"/>
               </w:rPr>
-              <w:t>ciclo</w:t>
+              <w:t>Linguagem</w:t>
             </w:r>
           </w:p>
         </w:tc>
         <w:tc>
           <w:tcPr>
-            <w:tcW w:type="dxa" w:w="4968"/>
+            <w:tcW w:type="dxa" w:w="5040"/>
+            <w:vAlign w:val="center"/>
           </w:tcPr>
           <w:p>
+            <w:r/>
             <w:r>
               <w:rPr>
-                <w:rFonts w:ascii="Arial" w:hAnsi="Arial" w:eastAsia="Arial"/>
                 <w:b w:val="0"/>
                 <w:sz w:val="20"/>
               </w:rPr>
-              <w:t>Tipo de ciclo da assinatura, mensal ou anual.</w:t>
+              <w:t>Python</w:t>
             </w:r>
           </w:p>
         </w:tc>
@@ -240,31 +206,33 @@
       <w:tr>
         <w:tc>
           <w:tcPr>
-            <w:tcW w:type="dxa" w:w="4968"/>
+            <w:tcW w:type="dxa" w:w="5040"/>
+            <w:vAlign w:val="center"/>
           </w:tcPr>
           <w:p>
+            <w:r/>
             <w:r>
               <w:rPr>
-                <w:rFonts w:ascii="Arial" w:hAnsi="Arial" w:eastAsia="Arial"/>
                 <w:b w:val="0"/>
                 <w:sz w:val="20"/>
               </w:rPr>
-              <w:t>status</w:t>
+              <w:t>Finalidade</w:t>
             </w:r>
           </w:p>
         </w:tc>
         <w:tc>
           <w:tcPr>
-            <w:tcW w:type="dxa" w:w="4968"/>
+            <w:tcW w:type="dxa" w:w="5040"/>
+            <w:vAlign w:val="center"/>
           </w:tcPr>
           <w:p>
+            <w:r/>
             <w:r>
               <w:rPr>
-                <w:rFonts w:ascii="Arial" w:hAnsi="Arial" w:eastAsia="Arial"/>
                 <w:b w:val="0"/>
                 <w:sz w:val="20"/>
               </w:rPr>
-              <w:t>Situação da assinatura, ativa ou cancelada.</w:t>
+              <w:t>Classificação estratégica dos clientes</w:t>
             </w:r>
           </w:p>
         </w:tc>
@@ -272,63 +240,33 @@
       <w:tr>
         <w:tc>
           <w:tcPr>
-            <w:tcW w:type="dxa" w:w="4968"/>
+            <w:tcW w:type="dxa" w:w="5040"/>
+            <w:vAlign w:val="center"/>
           </w:tcPr>
           <w:p>
+            <w:r/>
             <w:r>
               <w:rPr>
-                <w:rFonts w:ascii="Arial" w:hAnsi="Arial" w:eastAsia="Arial"/>
                 <w:b w:val="0"/>
                 <w:sz w:val="20"/>
               </w:rPr>
-              <w:t>planoId</w:t>
+              <w:t>Saídas</w:t>
             </w:r>
           </w:p>
         </w:tc>
         <w:tc>
           <w:tcPr>
-            <w:tcW w:type="dxa" w:w="4968"/>
+            <w:tcW w:type="dxa" w:w="5040"/>
+            <w:vAlign w:val="center"/>
           </w:tcPr>
           <w:p>
+            <w:r/>
             <w:r>
               <w:rPr>
-                <w:rFonts w:ascii="Arial" w:hAnsi="Arial" w:eastAsia="Arial"/>
                 <w:b w:val="0"/>
                 <w:sz w:val="20"/>
               </w:rPr>
-              <w:t>Plano contratado pelo cliente.</w:t>
-            </w:r>
-          </w:p>
-        </w:tc>
-      </w:tr>
-      <w:tr>
-        <w:tc>
-          <w:tcPr>
-            <w:tcW w:type="dxa" w:w="4968"/>
-          </w:tcPr>
-          <w:p>
-            <w:r>
-              <w:rPr>
-                <w:rFonts w:ascii="Arial" w:hAnsi="Arial" w:eastAsia="Arial"/>
-                <w:b w:val="0"/>
-                <w:sz w:val="20"/>
-              </w:rPr>
-              <w:t>historicoCancelamento</w:t>
-            </w:r>
-          </w:p>
-        </w:tc>
-        <w:tc>
-          <w:tcPr>
-            <w:tcW w:type="dxa" w:w="4968"/>
-          </w:tcPr>
-          <w:p>
-            <w:r>
-              <w:rPr>
-                <w:rFonts w:ascii="Arial" w:hAnsi="Arial" w:eastAsia="Arial"/>
-                <w:b w:val="0"/>
-                <w:sz w:val="20"/>
-              </w:rPr>
-              <w:t>Indica se o cliente já teve cancelamento.</w:t>
+              <w:t>Situação estratégica, risco de churn, potencial de crescimento e recomendação</w:t>
             </w:r>
           </w:p>
         </w:tc>
@@ -340,12 +278,7 @@
         <w:pStyle w:val="Heading1"/>
       </w:pPr>
       <w:r>
-        <w:rPr>
-          <w:rFonts w:ascii="Arial" w:hAnsi="Arial" w:eastAsia="Arial"/>
-          <w:b/>
-          <w:sz w:val="28"/>
-        </w:rPr>
-        <w:t>4. Saídas do modelo</w:t>
+        <w:t>3. Variáveis consideradas</w:t>
       </w:r>
     </w:p>
     <w:p>
@@ -353,12 +286,7 @@
         <w:pStyle w:val="ListBullet"/>
       </w:pPr>
       <w:r>
-        <w:rPr>
-          <w:rFonts w:ascii="Arial" w:hAnsi="Arial" w:eastAsia="Arial"/>
-          <w:b w:val="0"/>
-          <w:sz w:val="22"/>
-        </w:rPr>
-        <w:t>Risco de churn: indica a chance do cliente cancelar ou não renovar.</w:t>
+        <w:t>Quantidade de firewalls contratados.</w:t>
       </w:r>
     </w:p>
     <w:p>
@@ -366,12 +294,7 @@
         <w:pStyle w:val="ListBullet"/>
       </w:pPr>
       <w:r>
-        <w:rPr>
-          <w:rFonts w:ascii="Arial" w:hAnsi="Arial" w:eastAsia="Arial"/>
-          <w:b w:val="0"/>
-          <w:sz w:val="22"/>
-        </w:rPr>
-        <w:t>Propensão de compra: indica a chance de o cliente contratar mais ou realizar upgrade.</w:t>
+        <w:t>Valor mensal da assinatura.</w:t>
       </w:r>
     </w:p>
     <w:p>
@@ -379,12 +302,7 @@
         <w:pStyle w:val="ListBullet"/>
       </w:pPr>
       <w:r>
-        <w:rPr>
-          <w:rFonts w:ascii="Arial" w:hAnsi="Arial" w:eastAsia="Arial"/>
-          <w:b w:val="0"/>
-          <w:sz w:val="22"/>
-        </w:rPr>
-        <w:t>Classificação: baixa, média ou alta prioridade de acompanhamento.</w:t>
+        <w:t>Ciclo da assinatura, mensal ou anual.</w:t>
       </w:r>
     </w:p>
     <w:p>
@@ -392,12 +310,31 @@
         <w:pStyle w:val="ListBullet"/>
       </w:pPr>
       <w:r>
-        <w:rPr>
-          <w:rFonts w:ascii="Arial" w:hAnsi="Arial" w:eastAsia="Arial"/>
-          <w:b w:val="0"/>
-          <w:sz w:val="22"/>
-        </w:rPr>
-        <w:t>Recomendação estratégica: ação simples para a empresa tomar.</w:t>
+        <w:t>Status da assinatura, ativa ou cancelada.</w:t>
+      </w:r>
+    </w:p>
+    <w:p>
+      <w:pPr>
+        <w:pStyle w:val="ListBullet"/>
+      </w:pPr>
+      <w:r>
+        <w:t>Histórico de cancelamento.</w:t>
+      </w:r>
+    </w:p>
+    <w:p>
+      <w:pPr>
+        <w:pStyle w:val="ListBullet"/>
+      </w:pPr>
+      <w:r>
+        <w:t>Plano contratado.</w:t>
+      </w:r>
+    </w:p>
+    <w:p>
+      <w:pPr>
+        <w:pStyle w:val="ListBullet"/>
+      </w:pPr>
+      <w:r>
+        <w:t>Dados derivados por cliente a partir das assinaturas.</w:t>
       </w:r>
     </w:p>
     <w:p>
@@ -405,12 +342,63 @@
         <w:pStyle w:val="Heading1"/>
       </w:pPr>
       <w:r>
-        <w:rPr>
-          <w:rFonts w:ascii="Arial" w:hAnsi="Arial" w:eastAsia="Arial"/>
-          <w:b/>
-          <w:sz w:val="28"/>
-        </w:rPr>
-        <w:t>5. Arquivos da IA</w:t>
+        <w:t>4. Fluxo de funcionamento</w:t>
+      </w:r>
+    </w:p>
+    <w:p>
+      <w:pPr>
+        <w:pStyle w:val="ListNumber"/>
+      </w:pPr>
+      <w:r>
+        <w:t>Os dados de treinamento são carregados a partir de arquivo CSV.</w:t>
+      </w:r>
+    </w:p>
+    <w:p>
+      <w:pPr>
+        <w:pStyle w:val="ListNumber"/>
+      </w:pPr>
+      <w:r>
+        <w:t>Os dados passam por tratamento básico, incluindo duplicados, valores ausentes, outliers e normalização.</w:t>
+      </w:r>
+    </w:p>
+    <w:p>
+      <w:pPr>
+        <w:pStyle w:val="ListNumber"/>
+      </w:pPr>
+      <w:r>
+        <w:t>O modelo Random Forest é treinado com os dados preparados.</w:t>
+      </w:r>
+    </w:p>
+    <w:p>
+      <w:pPr>
+        <w:pStyle w:val="ListNumber"/>
+      </w:pPr>
+      <w:r>
+        <w:t>O arquivo modelo_random_forest.pkl é gerado e utilizado nas previsões.</w:t>
+      </w:r>
+    </w:p>
+    <w:p>
+      <w:pPr>
+        <w:pStyle w:val="ListNumber"/>
+      </w:pPr>
+      <w:r>
+        <w:t>O backend NestJS consulta os dados cadastrados no banco e aciona o script Python.</w:t>
+      </w:r>
+    </w:p>
+    <w:p>
+      <w:pPr>
+        <w:pStyle w:val="ListNumber"/>
+      </w:pPr>
+      <w:r>
+        <w:t>O resultado é exibido na tela de Crescimento Estratégico do frontend.</w:t>
+      </w:r>
+    </w:p>
+    <w:p>
+      <w:pPr>
+        <w:pStyle w:val="Heading1"/>
+      </w:pPr>
+      <w:r>
+        <w:t>5. Interpretação dos resultados</w:t>
       </w:r>
     </w:p>
     <w:tbl>
@@ -421,41 +409,59 @@
         <w:tblLook w:firstColumn="1" w:firstRow="1" w:lastColumn="0" w:lastRow="0" w:noHBand="0" w:noVBand="1" w:val="04A0"/>
       </w:tblPr>
       <w:tblGrid>
-        <w:gridCol w:w="4968"/>
-        <w:gridCol w:w="4968"/>
+        <w:gridCol w:w="3360"/>
+        <w:gridCol w:w="3360"/>
+        <w:gridCol w:w="3360"/>
       </w:tblGrid>
       <w:tr>
         <w:tc>
           <w:tcPr>
-            <w:tcW w:type="dxa" w:w="4968"/>
+            <w:tcW w:type="dxa" w:w="3360"/>
+            <w:vAlign w:val="center"/>
             <w:shd w:fill="D9EAF7"/>
-            <w:vAlign w:val="center"/>
           </w:tcPr>
           <w:p>
+            <w:r/>
             <w:r>
               <w:rPr>
-                <w:rFonts w:ascii="Arial" w:hAnsi="Arial" w:eastAsia="Arial"/>
                 <w:b/>
                 <w:sz w:val="20"/>
               </w:rPr>
-              <w:t>Arquivo</w:t>
+              <w:t>Situação</w:t>
             </w:r>
           </w:p>
         </w:tc>
         <w:tc>
           <w:tcPr>
-            <w:tcW w:type="dxa" w:w="4968"/>
+            <w:tcW w:type="dxa" w:w="3360"/>
+            <w:vAlign w:val="center"/>
             <w:shd w:fill="D9EAF7"/>
-            <w:vAlign w:val="center"/>
           </w:tcPr>
           <w:p>
+            <w:r/>
             <w:r>
               <w:rPr>
-                <w:rFonts w:ascii="Arial" w:hAnsi="Arial" w:eastAsia="Arial"/>
                 <w:b/>
                 <w:sz w:val="20"/>
               </w:rPr>
-              <w:t>Função</w:t>
+              <w:t>Significado</w:t>
+            </w:r>
+          </w:p>
+        </w:tc>
+        <w:tc>
+          <w:tcPr>
+            <w:tcW w:type="dxa" w:w="3360"/>
+            <w:vAlign w:val="center"/>
+            <w:shd w:fill="D9EAF7"/>
+          </w:tcPr>
+          <w:p>
+            <w:r/>
+            <w:r>
+              <w:rPr>
+                <w:b/>
+                <w:sz w:val="20"/>
+              </w:rPr>
+              <w:t>Ação sugerida</w:t>
             </w:r>
           </w:p>
         </w:tc>
@@ -463,31 +469,49 @@
       <w:tr>
         <w:tc>
           <w:tcPr>
-            <w:tcW w:type="dxa" w:w="4968"/>
+            <w:tcW w:type="dxa" w:w="3360"/>
+            <w:vAlign w:val="center"/>
           </w:tcPr>
           <w:p>
+            <w:r/>
             <w:r>
               <w:rPr>
-                <w:rFonts w:ascii="Arial" w:hAnsi="Arial" w:eastAsia="Arial"/>
                 <w:b w:val="0"/>
                 <w:sz w:val="20"/>
               </w:rPr>
-              <w:t>dados_treinamento.csv</w:t>
+              <w:t>Churn confirmado</w:t>
             </w:r>
           </w:p>
         </w:tc>
         <w:tc>
           <w:tcPr>
-            <w:tcW w:type="dxa" w:w="4968"/>
+            <w:tcW w:type="dxa" w:w="3360"/>
+            <w:vAlign w:val="center"/>
           </w:tcPr>
           <w:p>
+            <w:r/>
             <w:r>
               <w:rPr>
-                <w:rFonts w:ascii="Arial" w:hAnsi="Arial" w:eastAsia="Arial"/>
                 <w:b w:val="0"/>
                 <w:sz w:val="20"/>
               </w:rPr>
-              <w:t>Base simples usada para treinar o modelo.</w:t>
+              <w:t>Cliente já cancelou e não possui assinatura ativa.</w:t>
+            </w:r>
+          </w:p>
+        </w:tc>
+        <w:tc>
+          <w:tcPr>
+            <w:tcW w:type="dxa" w:w="3360"/>
+            <w:vAlign w:val="center"/>
+          </w:tcPr>
+          <w:p>
+            <w:r/>
+            <w:r>
+              <w:rPr>
+                <w:b w:val="0"/>
+                <w:sz w:val="20"/>
+              </w:rPr>
+              <w:t>Tentar reativação com contato comercial ou condição especial.</w:t>
             </w:r>
           </w:p>
         </w:tc>
@@ -495,31 +519,49 @@
       <w:tr>
         <w:tc>
           <w:tcPr>
-            <w:tcW w:type="dxa" w:w="4968"/>
+            <w:tcW w:type="dxa" w:w="3360"/>
+            <w:vAlign w:val="center"/>
           </w:tcPr>
           <w:p>
+            <w:r/>
             <w:r>
               <w:rPr>
-                <w:rFonts w:ascii="Arial" w:hAnsi="Arial" w:eastAsia="Arial"/>
                 <w:b w:val="0"/>
                 <w:sz w:val="20"/>
               </w:rPr>
-              <w:t>treinar_modelo.py</w:t>
+              <w:t>Cliente em risco</w:t>
             </w:r>
           </w:p>
         </w:tc>
         <w:tc>
           <w:tcPr>
-            <w:tcW w:type="dxa" w:w="4968"/>
+            <w:tcW w:type="dxa" w:w="3360"/>
+            <w:vAlign w:val="center"/>
           </w:tcPr>
           <w:p>
+            <w:r/>
             <w:r>
               <w:rPr>
-                <w:rFonts w:ascii="Arial" w:hAnsi="Arial" w:eastAsia="Arial"/>
                 <w:b w:val="0"/>
                 <w:sz w:val="20"/>
               </w:rPr>
-              <w:t>Treina o Random Forest e salva o modelo.</w:t>
+              <w:t>Cliente ativo com risco alto de cancelamento.</w:t>
+            </w:r>
+          </w:p>
+        </w:tc>
+        <w:tc>
+          <w:tcPr>
+            <w:tcW w:type="dxa" w:w="3360"/>
+            <w:vAlign w:val="center"/>
+          </w:tcPr>
+          <w:p>
+            <w:r/>
+            <w:r>
+              <w:rPr>
+                <w:b w:val="0"/>
+                <w:sz w:val="20"/>
+              </w:rPr>
+              <w:t>Realizar ação de retenção e acompanhamento próximo.</w:t>
             </w:r>
           </w:p>
         </w:tc>
@@ -527,31 +569,49 @@
       <w:tr>
         <w:tc>
           <w:tcPr>
-            <w:tcW w:type="dxa" w:w="4968"/>
+            <w:tcW w:type="dxa" w:w="3360"/>
+            <w:vAlign w:val="center"/>
           </w:tcPr>
           <w:p>
+            <w:r/>
             <w:r>
               <w:rPr>
-                <w:rFonts w:ascii="Arial" w:hAnsi="Arial" w:eastAsia="Arial"/>
                 <w:b w:val="0"/>
                 <w:sz w:val="20"/>
               </w:rPr>
-              <w:t>prever_clientes.py</w:t>
+              <w:t>Oportunidade de crescimento</w:t>
             </w:r>
           </w:p>
         </w:tc>
         <w:tc>
           <w:tcPr>
-            <w:tcW w:type="dxa" w:w="4968"/>
+            <w:tcW w:type="dxa" w:w="3360"/>
+            <w:vAlign w:val="center"/>
           </w:tcPr>
           <w:p>
+            <w:r/>
             <w:r>
               <w:rPr>
-                <w:rFonts w:ascii="Arial" w:hAnsi="Arial" w:eastAsia="Arial"/>
                 <w:b w:val="0"/>
                 <w:sz w:val="20"/>
               </w:rPr>
-              <w:t>Recebe clientes e retorna as previsões.</w:t>
+              <w:t>Cliente ativo com potencial de compra ou upgrade.</w:t>
+            </w:r>
+          </w:p>
+        </w:tc>
+        <w:tc>
+          <w:tcPr>
+            <w:tcW w:type="dxa" w:w="3360"/>
+            <w:vAlign w:val="center"/>
+          </w:tcPr>
+          <w:p>
+            <w:r/>
+            <w:r>
+              <w:rPr>
+                <w:b w:val="0"/>
+                <w:sz w:val="20"/>
+              </w:rPr>
+              <w:t>Oferecer upgrade de plano ou pacote adicional.</w:t>
             </w:r>
           </w:p>
         </w:tc>
@@ -559,63 +619,49 @@
       <w:tr>
         <w:tc>
           <w:tcPr>
-            <w:tcW w:type="dxa" w:w="4968"/>
+            <w:tcW w:type="dxa" w:w="3360"/>
+            <w:vAlign w:val="center"/>
           </w:tcPr>
           <w:p>
+            <w:r/>
             <w:r>
               <w:rPr>
-                <w:rFonts w:ascii="Arial" w:hAnsi="Arial" w:eastAsia="Arial"/>
                 <w:b w:val="0"/>
                 <w:sz w:val="20"/>
               </w:rPr>
-              <w:t>modelo_random_forest.pkl</w:t>
+              <w:t>Cliente estável</w:t>
             </w:r>
           </w:p>
         </w:tc>
         <w:tc>
           <w:tcPr>
-            <w:tcW w:type="dxa" w:w="4968"/>
+            <w:tcW w:type="dxa" w:w="3360"/>
+            <w:vAlign w:val="center"/>
           </w:tcPr>
           <w:p>
+            <w:r/>
             <w:r>
               <w:rPr>
-                <w:rFonts w:ascii="Arial" w:hAnsi="Arial" w:eastAsia="Arial"/>
                 <w:b w:val="0"/>
                 <w:sz w:val="20"/>
               </w:rPr>
-              <w:t>Modelo treinado salvo com Joblib.</w:t>
-            </w:r>
-          </w:p>
-        </w:tc>
-      </w:tr>
-      <w:tr>
-        <w:tc>
-          <w:tcPr>
-            <w:tcW w:type="dxa" w:w="4968"/>
-          </w:tcPr>
-          <w:p>
-            <w:r>
-              <w:rPr>
-                <w:rFonts w:ascii="Arial" w:hAnsi="Arial" w:eastAsia="Arial"/>
-                <w:b w:val="0"/>
-                <w:sz w:val="20"/>
-              </w:rPr>
-              <w:t>requirements.txt</w:t>
+              <w:t>Cliente ativo com baixo risco e potencial moderado.</w:t>
             </w:r>
           </w:p>
         </w:tc>
         <w:tc>
           <w:tcPr>
-            <w:tcW w:type="dxa" w:w="4968"/>
+            <w:tcW w:type="dxa" w:w="3360"/>
+            <w:vAlign w:val="center"/>
           </w:tcPr>
           <w:p>
+            <w:r/>
             <w:r>
               <w:rPr>
-                <w:rFonts w:ascii="Arial" w:hAnsi="Arial" w:eastAsia="Arial"/>
                 <w:b w:val="0"/>
                 <w:sz w:val="20"/>
               </w:rPr>
-              <w:t>Bibliotecas necessárias para rodar a IA.</w:t>
+              <w:t>Manter relacionamento e acompanhar renovações.</w:t>
             </w:r>
           </w:p>
         </w:tc>
@@ -627,30 +673,20 @@
         <w:pStyle w:val="Heading1"/>
       </w:pPr>
       <w:r>
-        <w:rPr>
-          <w:rFonts w:ascii="Arial" w:hAnsi="Arial" w:eastAsia="Arial"/>
-          <w:b/>
-          <w:sz w:val="28"/>
-        </w:rPr>
-        <w:t>6. Justificativa</w:t>
+        <w:t>6. Observações</w:t>
       </w:r>
     </w:p>
     <w:p>
       <w:pPr>
-        <w:spacing w:after="120"/>
+        <w:jc w:val="both"/>
       </w:pPr>
       <w:r>
-        <w:rPr>
-          <w:rFonts w:ascii="Arial" w:hAnsi="Arial" w:eastAsia="Arial"/>
-          <w:b w:val="0"/>
-          <w:sz w:val="22"/>
-        </w:rPr>
-        <w:t>Como a base real do sistema ainda é pequena, foi usada uma base simples de treinamento para demonstrar o funcionamento do Random Forest. O sistema pode ser evoluído futuramente com dados reais acumulados pelas assinaturas.</w:t>
+        <w:t>Como a base do projeto é pequena, o modelo foi utilizado de forma demonstrativa, com dados simples e regras de apoio. Mesmo assim, a estrutura atende ao objetivo acadêmico de demonstrar o uso de Random Forest integrado a um sistema web.</w:t>
       </w:r>
     </w:p>
     <w:sectPr>
       <w:pgSz w:w="12240" w:h="15840"/>
-      <w:pgMar w:top="1008" w:right="1152" w:bottom="1008" w:left="1152" w:header="720" w:footer="720" w:gutter="0"/>
+      <w:pgMar w:top="936" w:right="1080" w:bottom="936" w:left="1080" w:header="720" w:footer="720" w:gutter="0"/>
       <w:cols w:space="720"/>
       <w:docGrid w:linePitch="360"/>
     </w:sectPr>
@@ -1021,9 +1057,12 @@
     <w:name w:val="Normal"/>
     <w:qFormat/>
     <w:rsid w:val="00FC693F"/>
+    <w:pPr>
+      <w:spacing w:after="120"/>
+    </w:pPr>
     <w:rPr>
       <w:rFonts w:ascii="Arial" w:hAnsi="Arial" w:eastAsia="Arial"/>
-      <w:sz w:val="22"/>
+      <w:sz w:val="21"/>
     </w:rPr>
   </w:style>
   <w:style w:type="paragraph" w:styleId="Header">
@@ -1085,11 +1124,11 @@
       <w:outlineLvl w:val="0"/>
     </w:pPr>
     <w:rPr>
-      <w:rFonts w:asciiTheme="majorHAnsi" w:eastAsiaTheme="majorEastAsia" w:hAnsiTheme="majorHAnsi" w:cstheme="majorBidi"/>
+      <w:rFonts w:asciiTheme="majorHAnsi" w:eastAsiaTheme="majorEastAsia" w:hAnsiTheme="majorHAnsi" w:cstheme="majorBidi" w:ascii="Arial" w:hAnsi="Arial" w:eastAsia="Arial"/>
       <w:b/>
       <w:bCs/>
-      <w:color w:val="365F91" w:themeColor="accent1" w:themeShade="BF"/>
-      <w:sz w:val="28"/>
+      <w:color w:val="1F4E79"/>
+      <w:sz w:val="30"/>
       <w:szCs w:val="28"/>
     </w:rPr>
   </w:style>
@@ -1109,11 +1148,11 @@
       <w:outlineLvl w:val="1"/>
     </w:pPr>
     <w:rPr>
-      <w:rFonts w:asciiTheme="majorHAnsi" w:eastAsiaTheme="majorEastAsia" w:hAnsiTheme="majorHAnsi" w:cstheme="majorBidi"/>
+      <w:rFonts w:asciiTheme="majorHAnsi" w:eastAsiaTheme="majorEastAsia" w:hAnsiTheme="majorHAnsi" w:cstheme="majorBidi" w:ascii="Arial" w:hAnsi="Arial" w:eastAsia="Arial"/>
       <w:b/>
       <w:bCs/>
-      <w:color w:val="4F81BD" w:themeColor="accent1"/>
-      <w:sz w:val="26"/>
+      <w:color w:val="1F4E79"/>
+      <w:sz w:val="24"/>
       <w:szCs w:val="26"/>
     </w:rPr>
   </w:style>
@@ -1374,11 +1413,12 @@
       <w:contextualSpacing/>
     </w:pPr>
     <w:rPr>
-      <w:rFonts w:asciiTheme="majorHAnsi" w:eastAsiaTheme="majorEastAsia" w:hAnsiTheme="majorHAnsi" w:cstheme="majorBidi"/>
-      <w:color w:val="17365D" w:themeColor="text2" w:themeShade="BF"/>
+      <w:rFonts w:asciiTheme="majorHAnsi" w:eastAsiaTheme="majorEastAsia" w:hAnsiTheme="majorHAnsi" w:cstheme="majorBidi" w:ascii="Arial" w:hAnsi="Arial" w:eastAsia="Arial"/>
+      <w:b/>
+      <w:color w:val="1F4E79"/>
       <w:spacing w:val="5"/>
       <w:kern w:val="28"/>
-      <w:sz w:val="52"/>
+      <w:sz w:val="40"/>
       <w:szCs w:val="52"/>
     </w:rPr>
   </w:style>

</xml_diff>